<commit_message>
registro de decisiones tecnicas actualizado con los cambios recientes
</commit_message>
<xml_diff>
--- a/Decisiones_Tecnicas.docx
+++ b/Decisiones_Tecnicas.docx
@@ -1516,6 +1516,866 @@
                 <w:szCs w:val="18"/>
               </w:rPr>
               <w:t xml:space="preserve">Decisión de ingeniería</w:t>
+            </w:r>
+          </w:p>
+        </w:tc>
+      </w:tr>
+      <w:tr>
+        <w:tc>
+          <w:tcPr>
+            <w:tcW w:type="dxa" w:w="3200"/>
+            <w:tcBorders>
+              <w:top w:val="single" w:color="CCCCCC" w:sz="1"/>
+              <w:left w:val="single" w:color="CCCCCC" w:sz="1"/>
+              <w:bottom w:val="single" w:color="CCCCCC" w:sz="1"/>
+              <w:right w:val="single" w:color="CCCCCC" w:sz="1"/>
+            </w:tcBorders>
+            <w:shd w:fill="F4F4FB" w:val="clear"/>
+            <w:tcMar>
+              <w:top w:type="dxa" w:w="80"/>
+              <w:left w:type="dxa" w:w="120"/>
+              <w:bottom w:type="dxa" w:w="80"/>
+              <w:right w:type="dxa" w:w="120"/>
+            </w:tcMar>
+          </w:tcPr>
+          <w:p>
+            <w:r>
+              <w:rPr>
+                <w:b/>
+                <w:bCs/>
+                <w:sz w:val="19"/>
+                <w:szCs w:val="19"/>
+              </w:rPr>
+              <w:t xml:space="preserve">Embeddings multilingues (paraphrase-multilingual-mpnet-base-v2)</w:t>
+            </w:r>
+          </w:p>
+        </w:tc>
+        <w:tc>
+          <w:tcPr>
+            <w:tcW w:type="dxa" w:w="4560"/>
+            <w:tcBorders>
+              <w:top w:val="single" w:color="CCCCCC" w:sz="1"/>
+              <w:left w:val="single" w:color="CCCCCC" w:sz="1"/>
+              <w:bottom w:val="single" w:color="CCCCCC" w:sz="1"/>
+              <w:right w:val="single" w:color="CCCCCC" w:sz="1"/>
+            </w:tcBorders>
+            <w:shd w:fill="F4F4FB" w:val="clear"/>
+            <w:tcMar>
+              <w:top w:type="dxa" w:w="80"/>
+              <w:left w:type="dxa" w:w="120"/>
+              <w:bottom w:type="dxa" w:w="80"/>
+              <w:right w:type="dxa" w:w="120"/>
+            </w:tcMar>
+          </w:tcPr>
+          <w:p>
+            <w:r>
+              <w:rPr>
+                <w:sz w:val="19"/>
+                <w:szCs w:val="19"/>
+              </w:rPr>
+              <w:t xml:space="preserve">El modelo anterior era solo en ingles y el RAG no recuperaba bien los fragmentos en espanol: la busqueda fallaba. Con el modelo multilingue el RAG funciona de verdad en espanol.</w:t>
+            </w:r>
+          </w:p>
+        </w:tc>
+        <w:tc>
+          <w:tcPr>
+            <w:tcW w:type="dxa" w:w="1600"/>
+            <w:tcBorders>
+              <w:top w:val="single" w:color="CCCCCC" w:sz="1"/>
+              <w:left w:val="single" w:color="CCCCCC" w:sz="1"/>
+              <w:bottom w:val="single" w:color="CCCCCC" w:sz="1"/>
+              <w:right w:val="single" w:color="CCCCCC" w:sz="1"/>
+            </w:tcBorders>
+            <w:shd w:fill="F4F4FB" w:val="clear"/>
+            <w:tcMar>
+              <w:top w:type="dxa" w:w="80"/>
+              <w:left w:type="dxa" w:w="120"/>
+              <w:bottom w:type="dxa" w:w="80"/>
+              <w:right w:type="dxa" w:w="120"/>
+            </w:tcMar>
+          </w:tcPr>
+          <w:p>
+            <w:r>
+              <w:rPr>
+                <w:color w:val="555555"/>
+                <w:sz w:val="18"/>
+                <w:szCs w:val="18"/>
+              </w:rPr>
+              <w:t xml:space="preserve">Reimers &amp; Gurevych (2019)</w:t>
+            </w:r>
+          </w:p>
+        </w:tc>
+      </w:tr>
+      <w:tr>
+        <w:tc>
+          <w:tcPr>
+            <w:tcW w:type="dxa" w:w="3200"/>
+            <w:tcBorders>
+              <w:top w:val="single" w:color="CCCCCC" w:sz="1"/>
+              <w:left w:val="single" w:color="CCCCCC" w:sz="1"/>
+              <w:bottom w:val="single" w:color="CCCCCC" w:sz="1"/>
+              <w:right w:val="single" w:color="CCCCCC" w:sz="1"/>
+            </w:tcBorders>
+            <w:shd w:fill="F4F4FB" w:val="clear"/>
+            <w:tcMar>
+              <w:top w:type="dxa" w:w="80"/>
+              <w:left w:type="dxa" w:w="120"/>
+              <w:bottom w:type="dxa" w:w="80"/>
+              <w:right w:type="dxa" w:w="120"/>
+            </w:tcMar>
+          </w:tcPr>
+          <w:p>
+            <w:r>
+              <w:rPr>
+                <w:b/>
+                <w:bCs/>
+                <w:sz w:val="19"/>
+                <w:szCs w:val="19"/>
+              </w:rPr>
+              <w:t xml:space="preserve">Contexto de evaluacion condicional segun el largo del texto</w:t>
+            </w:r>
+          </w:p>
+        </w:tc>
+        <w:tc>
+          <w:tcPr>
+            <w:tcW w:type="dxa" w:w="4560"/>
+            <w:tcBorders>
+              <w:top w:val="single" w:color="CCCCCC" w:sz="1"/>
+              <w:left w:val="single" w:color="CCCCCC" w:sz="1"/>
+              <w:bottom w:val="single" w:color="CCCCCC" w:sz="1"/>
+              <w:right w:val="single" w:color="CCCCCC" w:sz="1"/>
+            </w:tcBorders>
+            <w:shd w:fill="F4F4FB" w:val="clear"/>
+            <w:tcMar>
+              <w:top w:type="dxa" w:w="80"/>
+              <w:left w:type="dxa" w:w="120"/>
+              <w:bottom w:type="dxa" w:w="80"/>
+              <w:right w:type="dxa" w:w="120"/>
+            </w:tcMar>
+          </w:tcPr>
+          <w:p>
+            <w:r>
+              <w:rPr>
+                <w:sz w:val="19"/>
+                <w:szCs w:val="19"/>
+              </w:rPr>
+              <w:t xml:space="preserve">Texto corto se pasa completo (mas preciso); texto largo (mas de 3000 caracteres) usa solo los fragmentos del RAG. Sin esto, o se mandaba todo el documento siempre (caro y lento) o el RAG nunca aportaba.</w:t>
+            </w:r>
+          </w:p>
+        </w:tc>
+        <w:tc>
+          <w:tcPr>
+            <w:tcW w:type="dxa" w:w="1600"/>
+            <w:tcBorders>
+              <w:top w:val="single" w:color="CCCCCC" w:sz="1"/>
+              <w:left w:val="single" w:color="CCCCCC" w:sz="1"/>
+              <w:bottom w:val="single" w:color="CCCCCC" w:sz="1"/>
+              <w:right w:val="single" w:color="CCCCCC" w:sz="1"/>
+            </w:tcBorders>
+            <w:shd w:fill="F4F4FB" w:val="clear"/>
+            <w:tcMar>
+              <w:top w:type="dxa" w:w="80"/>
+              <w:left w:type="dxa" w:w="120"/>
+              <w:bottom w:type="dxa" w:w="80"/>
+              <w:right w:type="dxa" w:w="120"/>
+            </w:tcMar>
+          </w:tcPr>
+          <w:p>
+            <w:r>
+              <w:rPr>
+                <w:color w:val="555555"/>
+                <w:sz w:val="18"/>
+                <w:szCs w:val="18"/>
+              </w:rPr>
+              <w:t xml:space="preserve">Decision de ingenieria</w:t>
+            </w:r>
+          </w:p>
+        </w:tc>
+      </w:tr>
+      <w:tr>
+        <w:tc>
+          <w:tcPr>
+            <w:tcW w:type="dxa" w:w="3200"/>
+            <w:tcBorders>
+              <w:top w:val="single" w:color="CCCCCC" w:sz="1"/>
+              <w:left w:val="single" w:color="CCCCCC" w:sz="1"/>
+              <w:bottom w:val="single" w:color="CCCCCC" w:sz="1"/>
+              <w:right w:val="single" w:color="CCCCCC" w:sz="1"/>
+            </w:tcBorders>
+            <w:shd w:fill="F4F4FB" w:val="clear"/>
+            <w:tcMar>
+              <w:top w:type="dxa" w:w="80"/>
+              <w:left w:type="dxa" w:w="120"/>
+              <w:bottom w:type="dxa" w:w="80"/>
+              <w:right w:type="dxa" w:w="120"/>
+            </w:tcMar>
+          </w:tcPr>
+          <w:p>
+            <w:r>
+              <w:rPr>
+                <w:b/>
+                <w:bCs/>
+                <w:sz w:val="19"/>
+                <w:szCs w:val="19"/>
+              </w:rPr>
+              <w:t xml:space="preserve">Taxonomia de Bloom revisada (recordar / inferir / evaluar)</w:t>
+            </w:r>
+          </w:p>
+        </w:tc>
+        <w:tc>
+          <w:tcPr>
+            <w:tcW w:type="dxa" w:w="4560"/>
+            <w:tcBorders>
+              <w:top w:val="single" w:color="CCCCCC" w:sz="1"/>
+              <w:left w:val="single" w:color="CCCCCC" w:sz="1"/>
+              <w:bottom w:val="single" w:color="CCCCCC" w:sz="1"/>
+              <w:right w:val="single" w:color="CCCCCC" w:sz="1"/>
+            </w:tcBorders>
+            <w:shd w:fill="F4F4FB" w:val="clear"/>
+            <w:tcMar>
+              <w:top w:type="dxa" w:w="80"/>
+              <w:left w:type="dxa" w:w="120"/>
+              <w:bottom w:type="dxa" w:w="80"/>
+              <w:right w:type="dxa" w:w="120"/>
+            </w:tcMar>
+          </w:tcPr>
+          <w:p>
+            <w:r>
+              <w:rPr>
+                <w:sz w:val="19"/>
+                <w:szCs w:val="19"/>
+              </w:rPr>
+              <w:t xml:space="preserve">Se actualizo la cita: las preguntas siguen la version revisada, que usa verbos y reordena las categorias superiores. La cita anterior (1956) estaba desactualizada.</w:t>
+            </w:r>
+          </w:p>
+        </w:tc>
+        <w:tc>
+          <w:tcPr>
+            <w:tcW w:type="dxa" w:w="1600"/>
+            <w:tcBorders>
+              <w:top w:val="single" w:color="CCCCCC" w:sz="1"/>
+              <w:left w:val="single" w:color="CCCCCC" w:sz="1"/>
+              <w:bottom w:val="single" w:color="CCCCCC" w:sz="1"/>
+              <w:right w:val="single" w:color="CCCCCC" w:sz="1"/>
+            </w:tcBorders>
+            <w:shd w:fill="F4F4FB" w:val="clear"/>
+            <w:tcMar>
+              <w:top w:type="dxa" w:w="80"/>
+              <w:left w:type="dxa" w:w="120"/>
+              <w:bottom w:type="dxa" w:w="80"/>
+              <w:right w:type="dxa" w:w="120"/>
+            </w:tcMar>
+          </w:tcPr>
+          <w:p>
+            <w:r>
+              <w:rPr>
+                <w:color w:val="555555"/>
+                <w:sz w:val="18"/>
+                <w:szCs w:val="18"/>
+              </w:rPr>
+              <w:t xml:space="preserve">Anderson &amp; Krathwohl (2001)</w:t>
+            </w:r>
+          </w:p>
+        </w:tc>
+      </w:tr>
+      <w:tr>
+        <w:tc>
+          <w:tcPr>
+            <w:tcW w:type="dxa" w:w="3200"/>
+            <w:tcBorders>
+              <w:top w:val="single" w:color="CCCCCC" w:sz="1"/>
+              <w:left w:val="single" w:color="CCCCCC" w:sz="1"/>
+              <w:bottom w:val="single" w:color="CCCCCC" w:sz="1"/>
+              <w:right w:val="single" w:color="CCCCCC" w:sz="1"/>
+            </w:tcBorders>
+            <w:shd w:fill="F4F4FB" w:val="clear"/>
+            <w:tcMar>
+              <w:top w:type="dxa" w:w="80"/>
+              <w:left w:type="dxa" w:w="120"/>
+              <w:bottom w:type="dxa" w:w="80"/>
+              <w:right w:type="dxa" w:w="120"/>
+            </w:tcMar>
+          </w:tcPr>
+          <w:p>
+            <w:r>
+              <w:rPr>
+                <w:b/>
+                <w:bCs/>
+                <w:sz w:val="19"/>
+                <w:szCs w:val="19"/>
+              </w:rPr>
+              <w:t xml:space="preserve">Evaluacion segun la dificultad de la pregunta</w:t>
+            </w:r>
+          </w:p>
+        </w:tc>
+        <w:tc>
+          <w:tcPr>
+            <w:tcW w:type="dxa" w:w="4560"/>
+            <w:tcBorders>
+              <w:top w:val="single" w:color="CCCCCC" w:sz="1"/>
+              <w:left w:val="single" w:color="CCCCCC" w:sz="1"/>
+              <w:bottom w:val="single" w:color="CCCCCC" w:sz="1"/>
+              <w:right w:val="single" w:color="CCCCCC" w:sz="1"/>
+            </w:tcBorders>
+            <w:shd w:fill="F4F4FB" w:val="clear"/>
+            <w:tcMar>
+              <w:top w:type="dxa" w:w="80"/>
+              <w:left w:type="dxa" w:w="120"/>
+              <w:bottom w:type="dxa" w:w="80"/>
+              <w:right w:type="dxa" w:w="120"/>
+            </w:tcMar>
+          </w:tcPr>
+          <w:p>
+            <w:r>
+              <w:rPr>
+                <w:sz w:val="19"/>
+                <w:szCs w:val="19"/>
+              </w:rPr>
+              <w:t xml:space="preserve">Las preguntas dificiles son de opinion y no tienen una respuesta unica en el texto: se evaluan por la calidad de la argumentacion, no por coincidencia. Sin esto, una opinion valida se marcaba incorrecta por no estar literal en el material.</w:t>
+            </w:r>
+          </w:p>
+        </w:tc>
+        <w:tc>
+          <w:tcPr>
+            <w:tcW w:type="dxa" w:w="1600"/>
+            <w:tcBorders>
+              <w:top w:val="single" w:color="CCCCCC" w:sz="1"/>
+              <w:left w:val="single" w:color="CCCCCC" w:sz="1"/>
+              <w:bottom w:val="single" w:color="CCCCCC" w:sz="1"/>
+              <w:right w:val="single" w:color="CCCCCC" w:sz="1"/>
+            </w:tcBorders>
+            <w:shd w:fill="F4F4FB" w:val="clear"/>
+            <w:tcMar>
+              <w:top w:type="dxa" w:w="80"/>
+              <w:left w:type="dxa" w:w="120"/>
+              <w:bottom w:type="dxa" w:w="80"/>
+              <w:right w:type="dxa" w:w="120"/>
+            </w:tcMar>
+          </w:tcPr>
+          <w:p>
+            <w:r>
+              <w:rPr>
+                <w:color w:val="555555"/>
+                <w:sz w:val="18"/>
+                <w:szCs w:val="18"/>
+              </w:rPr>
+              <w:t xml:space="preserve">Decision pedagogica</w:t>
+            </w:r>
+          </w:p>
+        </w:tc>
+      </w:tr>
+      <w:tr>
+        <w:tc>
+          <w:tcPr>
+            <w:tcW w:type="dxa" w:w="3200"/>
+            <w:tcBorders>
+              <w:top w:val="single" w:color="CCCCCC" w:sz="1"/>
+              <w:left w:val="single" w:color="CCCCCC" w:sz="1"/>
+              <w:bottom w:val="single" w:color="CCCCCC" w:sz="1"/>
+              <w:right w:val="single" w:color="CCCCCC" w:sz="1"/>
+            </w:tcBorders>
+            <w:shd w:fill="F4F4FB" w:val="clear"/>
+            <w:tcMar>
+              <w:top w:type="dxa" w:w="80"/>
+              <w:left w:type="dxa" w:w="120"/>
+              <w:bottom w:type="dxa" w:w="80"/>
+              <w:right w:type="dxa" w:w="120"/>
+            </w:tcMar>
+          </w:tcPr>
+          <w:p>
+            <w:r>
+              <w:rPr>
+                <w:b/>
+                <w:bCs/>
+                <w:sz w:val="19"/>
+                <w:szCs w:val="19"/>
+              </w:rPr>
+              <w:t xml:space="preserve">Pistas escalonadas y sin repeticion</w:t>
+            </w:r>
+          </w:p>
+        </w:tc>
+        <w:tc>
+          <w:tcPr>
+            <w:tcW w:type="dxa" w:w="4560"/>
+            <w:tcBorders>
+              <w:top w:val="single" w:color="CCCCCC" w:sz="1"/>
+              <w:left w:val="single" w:color="CCCCCC" w:sz="1"/>
+              <w:bottom w:val="single" w:color="CCCCCC" w:sz="1"/>
+              <w:right w:val="single" w:color="CCCCCC" w:sz="1"/>
+            </w:tcBorders>
+            <w:shd w:fill="F4F4FB" w:val="clear"/>
+            <w:tcMar>
+              <w:top w:type="dxa" w:w="80"/>
+              <w:left w:type="dxa" w:w="120"/>
+              <w:bottom w:type="dxa" w:w="80"/>
+              <w:right w:type="dxa" w:w="120"/>
+            </w:tcMar>
+          </w:tcPr>
+          <w:p>
+            <w:r>
+              <w:rPr>
+                <w:sz w:val="19"/>
+                <w:szCs w:val="19"/>
+              </w:rPr>
+              <w:t xml:space="preserve">Cada pista es mas especifica que la anterior (donde mirar, luego el concepto clave, luego casi la respuesta) y se le pasa la pista previa para que no la repita. Sin esto, pedir varias pistas devolvia siempre lo mismo.</w:t>
+            </w:r>
+          </w:p>
+        </w:tc>
+        <w:tc>
+          <w:tcPr>
+            <w:tcW w:type="dxa" w:w="1600"/>
+            <w:tcBorders>
+              <w:top w:val="single" w:color="CCCCCC" w:sz="1"/>
+              <w:left w:val="single" w:color="CCCCCC" w:sz="1"/>
+              <w:bottom w:val="single" w:color="CCCCCC" w:sz="1"/>
+              <w:right w:val="single" w:color="CCCCCC" w:sz="1"/>
+            </w:tcBorders>
+            <w:shd w:fill="F4F4FB" w:val="clear"/>
+            <w:tcMar>
+              <w:top w:type="dxa" w:w="80"/>
+              <w:left w:type="dxa" w:w="120"/>
+              <w:bottom w:type="dxa" w:w="80"/>
+              <w:right w:type="dxa" w:w="120"/>
+            </w:tcMar>
+          </w:tcPr>
+          <w:p>
+            <w:r>
+              <w:rPr>
+                <w:color w:val="555555"/>
+                <w:sz w:val="18"/>
+                <w:szCs w:val="18"/>
+              </w:rPr>
+              <w:t xml:space="preserve">Andamiaje (Wood, Bruner &amp; Ross, 1976)</w:t>
+            </w:r>
+          </w:p>
+        </w:tc>
+      </w:tr>
+      <w:tr>
+        <w:tc>
+          <w:tcPr>
+            <w:tcW w:type="dxa" w:w="3200"/>
+            <w:tcBorders>
+              <w:top w:val="single" w:color="CCCCCC" w:sz="1"/>
+              <w:left w:val="single" w:color="CCCCCC" w:sz="1"/>
+              <w:bottom w:val="single" w:color="CCCCCC" w:sz="1"/>
+              <w:right w:val="single" w:color="CCCCCC" w:sz="1"/>
+            </w:tcBorders>
+            <w:shd w:fill="F4F4FB" w:val="clear"/>
+            <w:tcMar>
+              <w:top w:type="dxa" w:w="80"/>
+              <w:left w:type="dxa" w:w="120"/>
+              <w:bottom w:type="dxa" w:w="80"/>
+              <w:right w:type="dxa" w:w="120"/>
+            </w:tcMar>
+          </w:tcPr>
+          <w:p>
+            <w:r>
+              <w:rPr>
+                <w:b/>
+                <w:bCs/>
+                <w:sz w:val="19"/>
+                <w:szCs w:val="19"/>
+              </w:rPr>
+              <w:t xml:space="preserve">Tope de pistas con avance garantizado</w:t>
+            </w:r>
+          </w:p>
+        </w:tc>
+        <w:tc>
+          <w:tcPr>
+            <w:tcW w:type="dxa" w:w="4560"/>
+            <w:tcBorders>
+              <w:top w:val="single" w:color="CCCCCC" w:sz="1"/>
+              <w:left w:val="single" w:color="CCCCCC" w:sz="1"/>
+              <w:bottom w:val="single" w:color="CCCCCC" w:sz="1"/>
+              <w:right w:val="single" w:color="CCCCCC" w:sz="1"/>
+            </w:tcBorders>
+            <w:shd w:fill="F4F4FB" w:val="clear"/>
+            <w:tcMar>
+              <w:top w:type="dxa" w:w="80"/>
+              <w:left w:type="dxa" w:w="120"/>
+              <w:bottom w:type="dxa" w:w="80"/>
+              <w:right w:type="dxa" w:w="120"/>
+            </w:tcMar>
+          </w:tcPr>
+          <w:p>
+            <w:r>
+              <w:rPr>
+                <w:sz w:val="19"/>
+                <w:szCs w:val="19"/>
+              </w:rPr>
+              <w:t xml:space="preserve">Tras un maximo de pistas, el tutor da una orientacion final y avanza. Sin esto, el alumno podia quedar atrapado en un bucle pidiendo ayuda sin poder progresar.</w:t>
+            </w:r>
+          </w:p>
+        </w:tc>
+        <w:tc>
+          <w:tcPr>
+            <w:tcW w:type="dxa" w:w="1600"/>
+            <w:tcBorders>
+              <w:top w:val="single" w:color="CCCCCC" w:sz="1"/>
+              <w:left w:val="single" w:color="CCCCCC" w:sz="1"/>
+              <w:bottom w:val="single" w:color="CCCCCC" w:sz="1"/>
+              <w:right w:val="single" w:color="CCCCCC" w:sz="1"/>
+            </w:tcBorders>
+            <w:shd w:fill="F4F4FB" w:val="clear"/>
+            <w:tcMar>
+              <w:top w:type="dxa" w:w="80"/>
+              <w:left w:type="dxa" w:w="120"/>
+              <w:bottom w:type="dxa" w:w="80"/>
+              <w:right w:type="dxa" w:w="120"/>
+            </w:tcMar>
+          </w:tcPr>
+          <w:p>
+            <w:r>
+              <w:rPr>
+                <w:color w:val="555555"/>
+                <w:sz w:val="18"/>
+                <w:szCs w:val="18"/>
+              </w:rPr>
+              <w:t xml:space="preserve">Andamiaje acotado</w:t>
+            </w:r>
+          </w:p>
+        </w:tc>
+      </w:tr>
+      <w:tr>
+        <w:tc>
+          <w:tcPr>
+            <w:tcW w:type="dxa" w:w="3200"/>
+            <w:tcBorders>
+              <w:top w:val="single" w:color="CCCCCC" w:sz="1"/>
+              <w:left w:val="single" w:color="CCCCCC" w:sz="1"/>
+              <w:bottom w:val="single" w:color="CCCCCC" w:sz="1"/>
+              <w:right w:val="single" w:color="CCCCCC" w:sz="1"/>
+            </w:tcBorders>
+            <w:shd w:fill="F4F4FB" w:val="clear"/>
+            <w:tcMar>
+              <w:top w:type="dxa" w:w="80"/>
+              <w:left w:type="dxa" w:w="120"/>
+              <w:bottom w:type="dxa" w:w="80"/>
+              <w:right w:type="dxa" w:w="120"/>
+            </w:tcMar>
+          </w:tcPr>
+          <w:p>
+            <w:r>
+              <w:rPr>
+                <w:b/>
+                <w:bCs/>
+                <w:sz w:val="19"/>
+                <w:szCs w:val="19"/>
+              </w:rPr>
+              <w:t xml:space="preserve">Encabezado de resultado explicito (correcto / parcial / incorrecto)</w:t>
+            </w:r>
+          </w:p>
+        </w:tc>
+        <w:tc>
+          <w:tcPr>
+            <w:tcW w:type="dxa" w:w="4560"/>
+            <w:tcBorders>
+              <w:top w:val="single" w:color="CCCCCC" w:sz="1"/>
+              <w:left w:val="single" w:color="CCCCCC" w:sz="1"/>
+              <w:bottom w:val="single" w:color="CCCCCC" w:sz="1"/>
+              <w:right w:val="single" w:color="CCCCCC" w:sz="1"/>
+            </w:tcBorders>
+            <w:shd w:fill="F4F4FB" w:val="clear"/>
+            <w:tcMar>
+              <w:top w:type="dxa" w:w="80"/>
+              <w:left w:type="dxa" w:w="120"/>
+              <w:bottom w:type="dxa" w:w="80"/>
+              <w:right w:type="dxa" w:w="120"/>
+            </w:tcMar>
+          </w:tcPr>
+          <w:p>
+            <w:r>
+              <w:rPr>
+                <w:sz w:val="19"/>
+                <w:szCs w:val="19"/>
+              </w:rPr>
+              <w:t xml:space="preserve">El alumno ve con claridad si acerto (“Muy bien, respuesta correcta”). Sin esto, el feedback podia sonar ambiguo y el alumno no sabia si su respuesta se conto como valida.</w:t>
+            </w:r>
+          </w:p>
+        </w:tc>
+        <w:tc>
+          <w:tcPr>
+            <w:tcW w:type="dxa" w:w="1600"/>
+            <w:tcBorders>
+              <w:top w:val="single" w:color="CCCCCC" w:sz="1"/>
+              <w:left w:val="single" w:color="CCCCCC" w:sz="1"/>
+              <w:bottom w:val="single" w:color="CCCCCC" w:sz="1"/>
+              <w:right w:val="single" w:color="CCCCCC" w:sz="1"/>
+            </w:tcBorders>
+            <w:shd w:fill="F4F4FB" w:val="clear"/>
+            <w:tcMar>
+              <w:top w:type="dxa" w:w="80"/>
+              <w:left w:type="dxa" w:w="120"/>
+              <w:bottom w:type="dxa" w:w="80"/>
+              <w:right w:type="dxa" w:w="120"/>
+            </w:tcMar>
+          </w:tcPr>
+          <w:p>
+            <w:r>
+              <w:rPr>
+                <w:color w:val="555555"/>
+                <w:sz w:val="18"/>
+                <w:szCs w:val="18"/>
+              </w:rPr>
+              <w:t xml:space="preserve">Decision de diseno</w:t>
+            </w:r>
+          </w:p>
+        </w:tc>
+      </w:tr>
+      <w:tr>
+        <w:tc>
+          <w:tcPr>
+            <w:tcW w:type="dxa" w:w="3200"/>
+            <w:tcBorders>
+              <w:top w:val="single" w:color="CCCCCC" w:sz="1"/>
+              <w:left w:val="single" w:color="CCCCCC" w:sz="1"/>
+              <w:bottom w:val="single" w:color="CCCCCC" w:sz="1"/>
+              <w:right w:val="single" w:color="CCCCCC" w:sz="1"/>
+            </w:tcBorders>
+            <w:shd w:fill="F4F4FB" w:val="clear"/>
+            <w:tcMar>
+              <w:top w:type="dxa" w:w="80"/>
+              <w:left w:type="dxa" w:w="120"/>
+              <w:bottom w:type="dxa" w:w="80"/>
+              <w:right w:type="dxa" w:w="120"/>
+            </w:tcMar>
+          </w:tcPr>
+          <w:p>
+            <w:r>
+              <w:rPr>
+                <w:b/>
+                <w:bCs/>
+                <w:sz w:val="19"/>
+                <w:szCs w:val="19"/>
+              </w:rPr>
+              <w:t xml:space="preserve">Notificaciones al docente (alumno se une o sale)</w:t>
+            </w:r>
+          </w:p>
+        </w:tc>
+        <w:tc>
+          <w:tcPr>
+            <w:tcW w:type="dxa" w:w="4560"/>
+            <w:tcBorders>
+              <w:top w:val="single" w:color="CCCCCC" w:sz="1"/>
+              <w:left w:val="single" w:color="CCCCCC" w:sz="1"/>
+              <w:bottom w:val="single" w:color="CCCCCC" w:sz="1"/>
+              <w:right w:val="single" w:color="CCCCCC" w:sz="1"/>
+            </w:tcBorders>
+            <w:shd w:fill="F4F4FB" w:val="clear"/>
+            <w:tcMar>
+              <w:top w:type="dxa" w:w="80"/>
+              <w:left w:type="dxa" w:w="120"/>
+              <w:bottom w:type="dxa" w:w="80"/>
+              <w:right w:type="dxa" w:w="120"/>
+            </w:tcMar>
+          </w:tcPr>
+          <w:p>
+            <w:r>
+              <w:rPr>
+                <w:sz w:val="19"/>
+                <w:szCs w:val="19"/>
+              </w:rPr>
+              <w:t xml:space="preserve">El docente se entera cuando alguien entra o sale de su clase, con una campanita y un contador de no leidas. Sin esto, no habia forma de saber quien se sumo sin revisar las metricas.</w:t>
+            </w:r>
+          </w:p>
+        </w:tc>
+        <w:tc>
+          <w:tcPr>
+            <w:tcW w:type="dxa" w:w="1600"/>
+            <w:tcBorders>
+              <w:top w:val="single" w:color="CCCCCC" w:sz="1"/>
+              <w:left w:val="single" w:color="CCCCCC" w:sz="1"/>
+              <w:bottom w:val="single" w:color="CCCCCC" w:sz="1"/>
+              <w:right w:val="single" w:color="CCCCCC" w:sz="1"/>
+            </w:tcBorders>
+            <w:shd w:fill="F4F4FB" w:val="clear"/>
+            <w:tcMar>
+              <w:top w:type="dxa" w:w="80"/>
+              <w:left w:type="dxa" w:w="120"/>
+              <w:bottom w:type="dxa" w:w="80"/>
+              <w:right w:type="dxa" w:w="120"/>
+            </w:tcMar>
+          </w:tcPr>
+          <w:p>
+            <w:r>
+              <w:rPr>
+                <w:color w:val="555555"/>
+                <w:sz w:val="18"/>
+                <w:szCs w:val="18"/>
+              </w:rPr>
+              <w:t xml:space="preserve">Decision de diseno</w:t>
+            </w:r>
+          </w:p>
+        </w:tc>
+      </w:tr>
+      <w:tr>
+        <w:tc>
+          <w:tcPr>
+            <w:tcW w:type="dxa" w:w="3200"/>
+            <w:tcBorders>
+              <w:top w:val="single" w:color="CCCCCC" w:sz="1"/>
+              <w:left w:val="single" w:color="CCCCCC" w:sz="1"/>
+              <w:bottom w:val="single" w:color="CCCCCC" w:sz="1"/>
+              <w:right w:val="single" w:color="CCCCCC" w:sz="1"/>
+            </w:tcBorders>
+            <w:shd w:fill="F4F4FB" w:val="clear"/>
+            <w:tcMar>
+              <w:top w:type="dxa" w:w="80"/>
+              <w:left w:type="dxa" w:w="120"/>
+              <w:bottom w:type="dxa" w:w="80"/>
+              <w:right w:type="dxa" w:w="120"/>
+            </w:tcMar>
+          </w:tcPr>
+          <w:p>
+            <w:r>
+              <w:rPr>
+                <w:b/>
+                <w:bCs/>
+                <w:sz w:val="19"/>
+                <w:szCs w:val="19"/>
+              </w:rPr>
+              <w:t xml:space="preserve">Integridad referencial completa (FK question_id) y borrado en orden</w:t>
+            </w:r>
+          </w:p>
+        </w:tc>
+        <w:tc>
+          <w:tcPr>
+            <w:tcW w:type="dxa" w:w="4560"/>
+            <w:tcBorders>
+              <w:top w:val="single" w:color="CCCCCC" w:sz="1"/>
+              <w:left w:val="single" w:color="CCCCCC" w:sz="1"/>
+              <w:bottom w:val="single" w:color="CCCCCC" w:sz="1"/>
+              <w:right w:val="single" w:color="CCCCCC" w:sz="1"/>
+            </w:tcBorders>
+            <w:shd w:fill="F4F4FB" w:val="clear"/>
+            <w:tcMar>
+              <w:top w:type="dxa" w:w="80"/>
+              <w:left w:type="dxa" w:w="120"/>
+              <w:bottom w:type="dxa" w:w="80"/>
+              <w:right w:type="dxa" w:w="120"/>
+            </w:tcMar>
+          </w:tcPr>
+          <w:p>
+            <w:r>
+              <w:rPr>
+                <w:sz w:val="19"/>
+                <w:szCs w:val="19"/>
+              </w:rPr>
+              <w:t xml:space="preserve">Se agrego la clave foranea que faltaba (student_answers.question_id) y al salir de una clase el progreso se borra respetando el orden de dependencias. Sin esto, el modelo no garantizaba del todo la integridad documentada.</w:t>
+            </w:r>
+          </w:p>
+        </w:tc>
+        <w:tc>
+          <w:tcPr>
+            <w:tcW w:type="dxa" w:w="1600"/>
+            <w:tcBorders>
+              <w:top w:val="single" w:color="CCCCCC" w:sz="1"/>
+              <w:left w:val="single" w:color="CCCCCC" w:sz="1"/>
+              <w:bottom w:val="single" w:color="CCCCCC" w:sz="1"/>
+              <w:right w:val="single" w:color="CCCCCC" w:sz="1"/>
+            </w:tcBorders>
+            <w:shd w:fill="F4F4FB" w:val="clear"/>
+            <w:tcMar>
+              <w:top w:type="dxa" w:w="80"/>
+              <w:left w:type="dxa" w:w="120"/>
+              <w:bottom w:type="dxa" w:w="80"/>
+              <w:right w:type="dxa" w:w="120"/>
+            </w:tcMar>
+          </w:tcPr>
+          <w:p>
+            <w:r>
+              <w:rPr>
+                <w:color w:val="555555"/>
+                <w:sz w:val="18"/>
+                <w:szCs w:val="18"/>
+              </w:rPr>
+              <w:t xml:space="preserve">Decision de ingenieria</w:t>
+            </w:r>
+          </w:p>
+        </w:tc>
+      </w:tr>
+      <w:tr>
+        <w:tc>
+          <w:tcPr>
+            <w:tcW w:type="dxa" w:w="3200"/>
+            <w:tcBorders>
+              <w:top w:val="single" w:color="CCCCCC" w:sz="1"/>
+              <w:left w:val="single" w:color="CCCCCC" w:sz="1"/>
+              <w:bottom w:val="single" w:color="CCCCCC" w:sz="1"/>
+              <w:right w:val="single" w:color="CCCCCC" w:sz="1"/>
+            </w:tcBorders>
+            <w:shd w:fill="F4F4FB" w:val="clear"/>
+            <w:tcMar>
+              <w:top w:type="dxa" w:w="80"/>
+              <w:left w:type="dxa" w:w="120"/>
+              <w:bottom w:type="dxa" w:w="80"/>
+              <w:right w:type="dxa" w:w="120"/>
+            </w:tcMar>
+          </w:tcPr>
+          <w:p>
+            <w:r>
+              <w:rPr>
+                <w:b/>
+                <w:bCs/>
+                <w:sz w:val="19"/>
+                <w:szCs w:val="19"/>
+              </w:rPr>
+              <w:t xml:space="preserve">Login solo con credenciales (rol como atributo de la cuenta)</w:t>
+            </w:r>
+          </w:p>
+        </w:tc>
+        <w:tc>
+          <w:tcPr>
+            <w:tcW w:type="dxa" w:w="4560"/>
+            <w:tcBorders>
+              <w:top w:val="single" w:color="CCCCCC" w:sz="1"/>
+              <w:left w:val="single" w:color="CCCCCC" w:sz="1"/>
+              <w:bottom w:val="single" w:color="CCCCCC" w:sz="1"/>
+              <w:right w:val="single" w:color="CCCCCC" w:sz="1"/>
+            </w:tcBorders>
+            <w:shd w:fill="F4F4FB" w:val="clear"/>
+            <w:tcMar>
+              <w:top w:type="dxa" w:w="80"/>
+              <w:left w:type="dxa" w:w="120"/>
+              <w:bottom w:type="dxa" w:w="80"/>
+              <w:right w:type="dxa" w:w="120"/>
+            </w:tcMar>
+          </w:tcPr>
+          <w:p>
+            <w:r>
+              <w:rPr>
+                <w:sz w:val="19"/>
+                <w:szCs w:val="19"/>
+              </w:rPr>
+              <w:t xml:space="preserve">El rol no se elige al iniciar sesion: se define una sola vez en el registro y se valida contra el dominio del correo institucional. Sin esto, pedir el rol en el login era redundante y confuso.</w:t>
+            </w:r>
+          </w:p>
+        </w:tc>
+        <w:tc>
+          <w:tcPr>
+            <w:tcW w:type="dxa" w:w="1600"/>
+            <w:tcBorders>
+              <w:top w:val="single" w:color="CCCCCC" w:sz="1"/>
+              <w:left w:val="single" w:color="CCCCCC" w:sz="1"/>
+              <w:bottom w:val="single" w:color="CCCCCC" w:sz="1"/>
+              <w:right w:val="single" w:color="CCCCCC" w:sz="1"/>
+            </w:tcBorders>
+            <w:shd w:fill="F4F4FB" w:val="clear"/>
+            <w:tcMar>
+              <w:top w:type="dxa" w:w="80"/>
+              <w:left w:type="dxa" w:w="120"/>
+              <w:bottom w:type="dxa" w:w="80"/>
+              <w:right w:type="dxa" w:w="120"/>
+            </w:tcMar>
+          </w:tcPr>
+          <w:p>
+            <w:r>
+              <w:rPr>
+                <w:color w:val="555555"/>
+                <w:sz w:val="18"/>
+                <w:szCs w:val="18"/>
+              </w:rPr>
+              <w:t xml:space="preserve">Decision de diseno</w:t>
             </w:r>
           </w:p>
         </w:tc>
@@ -1599,6 +2459,42 @@
           <w:szCs w:val="19"/>
         </w:rPr>
         <w:t xml:space="preserve">Siemens, G., &amp; Long, P. (2011). Penetrating the Fog: Analytics in Learning and Education. EDUCAUSE Review, 46(5).</w:t>
+      </w:r>
+    </w:p>
+    <w:p>
+      <w:pPr>
+        <w:spacing w:after="80"/>
+      </w:pPr>
+      <w:r>
+        <w:rPr>
+          <w:sz w:val="19"/>
+          <w:szCs w:val="19"/>
+        </w:rPr>
+        <w:t xml:space="preserve">Anderson, L. W., &amp; Krathwohl, D. R. (2001). A Taxonomy for Learning, Teaching, and Assessing. Longman.</w:t>
+      </w:r>
+    </w:p>
+    <w:p>
+      <w:pPr>
+        <w:spacing w:after="80"/>
+      </w:pPr>
+      <w:r>
+        <w:rPr>
+          <w:sz w:val="19"/>
+          <w:szCs w:val="19"/>
+        </w:rPr>
+        <w:t xml:space="preserve">Reimers, N., &amp; Gurevych, I. (2019). Sentence-BERT: Sentence Embeddings using Siamese BERT-Networks. EMNLP.</w:t>
+      </w:r>
+    </w:p>
+    <w:p>
+      <w:pPr>
+        <w:spacing w:after="80"/>
+      </w:pPr>
+      <w:r>
+        <w:rPr>
+          <w:sz w:val="19"/>
+          <w:szCs w:val="19"/>
+        </w:rPr>
+        <w:t xml:space="preserve">Wood, D., Bruner, J. S., &amp; Ross, G. (1976). The Role of Tutoring in Problem Solving. Journal of Child Psychology and Psychiatry, 17(2), 89-100.</w:t>
       </w:r>
     </w:p>
     <w:sectPr>

</xml_diff>

<commit_message>
docs: registro de decisiones tecnicas actualizado
- Diez decisiones nuevas: actividad 2+2+1, enfoques como enfasis, rechazo de textos cortos, una pista a pedido, barra de progreso, encuesta sobre el tutor, orden de las metricas, resumen sin datos personales, pruebas del modulo docente y prueba de alucinacion con contexto vacio.
- Las filas de pistas escalonadas y tope de pistas quedan marcadas como reemplazadas.
- Referencia nueva: Ley 25.326.
</commit_message>
<xml_diff>
--- a/Decisiones_Tecnicas.docx
+++ b/Decisiones_Tecnicas.docx
@@ -1890,7 +1890,7 @@
                 <w:sz w:val="19"/>
                 <w:szCs w:val="19"/>
               </w:rPr>
-              <w:t xml:space="preserve">Pistas escalonadas y sin repeticion</w:t>
+              <w:t>Pistas escalonadas y sin repeticion (reemplazada: ver «Una sola pista a pedido por pregunta»)</w:t>
             </w:r>
           </w:p>
         </w:tc>
@@ -1976,7 +1976,7 @@
                 <w:sz w:val="19"/>
                 <w:szCs w:val="19"/>
               </w:rPr>
-              <w:t xml:space="preserve">Tope de pistas con avance garantizado</w:t>
+              <w:t>Tope de pistas con avance garantizado (reemplazada: ver «Una sola pista a pedido por pregunta»)</w:t>
             </w:r>
           </w:p>
         </w:tc>
@@ -2376,6 +2376,866 @@
                 <w:szCs w:val="18"/>
               </w:rPr>
               <w:t xml:space="preserve">Decision de diseno</w:t>
+            </w:r>
+          </w:p>
+        </w:tc>
+      </w:tr>
+      <w:tr>
+        <w:tc>
+          <w:tcPr>
+            <w:tcW w:type="dxa" w:w="3200"/>
+            <w:tcBorders>
+              <w:top w:val="single" w:color="CCCCCC" w:sz="1"/>
+              <w:left w:val="single" w:color="CCCCCC" w:sz="1"/>
+              <w:bottom w:val="single" w:color="CCCCCC" w:sz="1"/>
+              <w:right w:val="single" w:color="CCCCCC" w:sz="1"/>
+            </w:tcBorders>
+            <w:shd w:fill="F4F4FB" w:val="clear"/>
+            <w:tcMar>
+              <w:top w:type="dxa" w:w="80"/>
+              <w:left w:type="dxa" w:w="120"/>
+              <w:bottom w:type="dxa" w:w="80"/>
+              <w:right w:type="dxa" w:w="120"/>
+            </w:tcMar>
+          </w:tcPr>
+          <w:p>
+            <w:r>
+              <w:rPr>
+                <w:b/>
+                <w:bCs/>
+                <w:sz w:val="19"/>
+                <w:szCs w:val="19"/>
+              </w:rPr>
+              <w:t>Actividad de cinco preguntas: 2 fáciles, 2 medias y 1 difícil</w:t>
+            </w:r>
+          </w:p>
+        </w:tc>
+        <w:tc>
+          <w:tcPr>
+            <w:tcW w:type="dxa" w:w="4560"/>
+            <w:tcBorders>
+              <w:top w:val="single" w:color="CCCCCC" w:sz="1"/>
+              <w:left w:val="single" w:color="CCCCCC" w:sz="1"/>
+              <w:bottom w:val="single" w:color="CCCCCC" w:sz="1"/>
+              <w:right w:val="single" w:color="CCCCCC" w:sz="1"/>
+            </w:tcBorders>
+            <w:shd w:fill="F4F4FB" w:val="clear"/>
+            <w:tcMar>
+              <w:top w:type="dxa" w:w="80"/>
+              <w:left w:type="dxa" w:w="120"/>
+              <w:bottom w:type="dxa" w:w="80"/>
+              <w:right w:type="dxa" w:w="120"/>
+            </w:tcMar>
+          </w:tcPr>
+          <w:p>
+            <w:r>
+              <w:rPr>
+                <w:sz w:val="19"/>
+                <w:szCs w:val="19"/>
+              </w:rPr>
+              <w:t>Da más práctica en los niveles bajos antes de exigir el juicio propio, que es lo más demandante. Sin esto, con una sola pregunta por nivel, el alumno llegaba a la pregunta difícil con poca práctica previa.</w:t>
+            </w:r>
+          </w:p>
+        </w:tc>
+        <w:tc>
+          <w:tcPr>
+            <w:tcW w:type="dxa" w:w="1600"/>
+            <w:tcBorders>
+              <w:top w:val="single" w:color="CCCCCC" w:sz="1"/>
+              <w:left w:val="single" w:color="CCCCCC" w:sz="1"/>
+              <w:bottom w:val="single" w:color="CCCCCC" w:sz="1"/>
+              <w:right w:val="single" w:color="CCCCCC" w:sz="1"/>
+            </w:tcBorders>
+            <w:shd w:fill="F4F4FB" w:val="clear"/>
+            <w:tcMar>
+              <w:top w:type="dxa" w:w="80"/>
+              <w:left w:type="dxa" w:w="120"/>
+              <w:bottom w:type="dxa" w:w="80"/>
+              <w:right w:type="dxa" w:w="120"/>
+            </w:tcMar>
+          </w:tcPr>
+          <w:p>
+            <w:r>
+              <w:rPr>
+                <w:color w:val="555555"/>
+                <w:sz w:val="18"/>
+                <w:szCs w:val="18"/>
+              </w:rPr>
+              <w:t>Anderson &amp; Krathwohl (2001)</w:t>
+            </w:r>
+          </w:p>
+        </w:tc>
+      </w:tr>
+      <w:tr>
+        <w:tc>
+          <w:tcPr>
+            <w:tcW w:type="dxa" w:w="3200"/>
+            <w:tcBorders>
+              <w:top w:val="single" w:color="CCCCCC" w:sz="1"/>
+              <w:left w:val="single" w:color="CCCCCC" w:sz="1"/>
+              <w:bottom w:val="single" w:color="CCCCCC" w:sz="1"/>
+              <w:right w:val="single" w:color="CCCCCC" w:sz="1"/>
+            </w:tcBorders>
+            <w:shd w:fill="F4F4FB" w:val="clear"/>
+            <w:tcMar>
+              <w:top w:type="dxa" w:w="80"/>
+              <w:left w:type="dxa" w:w="120"/>
+              <w:bottom w:type="dxa" w:w="80"/>
+              <w:right w:type="dxa" w:w="120"/>
+            </w:tcMar>
+          </w:tcPr>
+          <w:p>
+            <w:r>
+              <w:rPr>
+                <w:b/>
+                <w:bCs/>
+                <w:sz w:val="19"/>
+                <w:szCs w:val="19"/>
+              </w:rPr>
+              <w:t>Enfoques pedagógicos como énfasis en 2 o 3 preguntas (máximo 3 enfoques)</w:t>
+            </w:r>
+          </w:p>
+        </w:tc>
+        <w:tc>
+          <w:tcPr>
+            <w:tcW w:type="dxa" w:w="4560"/>
+            <w:tcBorders>
+              <w:top w:val="single" w:color="CCCCCC" w:sz="1"/>
+              <w:left w:val="single" w:color="CCCCCC" w:sz="1"/>
+              <w:bottom w:val="single" w:color="CCCCCC" w:sz="1"/>
+              <w:right w:val="single" w:color="CCCCCC" w:sz="1"/>
+            </w:tcBorders>
+            <w:shd w:fill="F4F4FB" w:val="clear"/>
+            <w:tcMar>
+              <w:top w:type="dxa" w:w="80"/>
+              <w:left w:type="dxa" w:w="120"/>
+              <w:bottom w:type="dxa" w:w="80"/>
+              <w:right w:type="dxa" w:w="120"/>
+            </w:tcMar>
+          </w:tcPr>
+          <w:p>
+            <w:r>
+              <w:rPr>
+                <w:sz w:val="19"/>
+                <w:szCs w:val="19"/>
+              </w:rPr>
+              <w:t>Pedidos de forma general, el modelo ignoraba los enfoques y dominaba la estructura de Bloom. Asignados de forma explícita a algunas preguntas, se notan sin desplazar la comprensión general del texto. El efecto es parcial y no se midió formalmente.</w:t>
+            </w:r>
+          </w:p>
+        </w:tc>
+        <w:tc>
+          <w:tcPr>
+            <w:tcW w:type="dxa" w:w="1600"/>
+            <w:tcBorders>
+              <w:top w:val="single" w:color="CCCCCC" w:sz="1"/>
+              <w:left w:val="single" w:color="CCCCCC" w:sz="1"/>
+              <w:bottom w:val="single" w:color="CCCCCC" w:sz="1"/>
+              <w:right w:val="single" w:color="CCCCCC" w:sz="1"/>
+            </w:tcBorders>
+            <w:shd w:fill="F4F4FB" w:val="clear"/>
+            <w:tcMar>
+              <w:top w:type="dxa" w:w="80"/>
+              <w:left w:type="dxa" w:w="120"/>
+              <w:bottom w:type="dxa" w:w="80"/>
+              <w:right w:type="dxa" w:w="120"/>
+            </w:tcMar>
+          </w:tcPr>
+          <w:p>
+            <w:r>
+              <w:rPr>
+                <w:color w:val="555555"/>
+                <w:sz w:val="18"/>
+                <w:szCs w:val="18"/>
+              </w:rPr>
+              <w:t>Pruebas propias</w:t>
+            </w:r>
+          </w:p>
+        </w:tc>
+      </w:tr>
+      <w:tr>
+        <w:tc>
+          <w:tcPr>
+            <w:tcW w:type="dxa" w:w="3200"/>
+            <w:tcBorders>
+              <w:top w:val="single" w:color="CCCCCC" w:sz="1"/>
+              <w:left w:val="single" w:color="CCCCCC" w:sz="1"/>
+              <w:bottom w:val="single" w:color="CCCCCC" w:sz="1"/>
+              <w:right w:val="single" w:color="CCCCCC" w:sz="1"/>
+            </w:tcBorders>
+            <w:shd w:fill="F4F4FB" w:val="clear"/>
+            <w:tcMar>
+              <w:top w:type="dxa" w:w="80"/>
+              <w:left w:type="dxa" w:w="120"/>
+              <w:bottom w:type="dxa" w:w="80"/>
+              <w:right w:type="dxa" w:w="120"/>
+            </w:tcMar>
+          </w:tcPr>
+          <w:p>
+            <w:r>
+              <w:rPr>
+                <w:b/>
+                <w:bCs/>
+                <w:sz w:val="19"/>
+                <w:szCs w:val="19"/>
+              </w:rPr>
+              <w:t>Rechazo de documentos con menos de 1000 caracteres</w:t>
+            </w:r>
+          </w:p>
+        </w:tc>
+        <w:tc>
+          <w:tcPr>
+            <w:tcW w:type="dxa" w:w="4560"/>
+            <w:tcBorders>
+              <w:top w:val="single" w:color="CCCCCC" w:sz="1"/>
+              <w:left w:val="single" w:color="CCCCCC" w:sz="1"/>
+              <w:bottom w:val="single" w:color="CCCCCC" w:sz="1"/>
+              <w:right w:val="single" w:color="CCCCCC" w:sz="1"/>
+            </w:tcBorders>
+            <w:shd w:fill="F4F4FB" w:val="clear"/>
+            <w:tcMar>
+              <w:top w:type="dxa" w:w="80"/>
+              <w:left w:type="dxa" w:w="120"/>
+              <w:bottom w:type="dxa" w:w="80"/>
+              <w:right w:type="dxa" w:w="120"/>
+            </w:tcMar>
+          </w:tcPr>
+          <w:p>
+            <w:r>
+              <w:rPr>
+                <w:sz w:val="19"/>
+                <w:szCs w:val="19"/>
+              </w:rPr>
+              <w:t>Un PDF escaneado como imagen no tiene texto seleccionable. Sin este control se generaba una actividad pobre sobre un texto casi vacío; ahora se le avisa al docente.</w:t>
+            </w:r>
+          </w:p>
+        </w:tc>
+        <w:tc>
+          <w:tcPr>
+            <w:tcW w:type="dxa" w:w="1600"/>
+            <w:tcBorders>
+              <w:top w:val="single" w:color="CCCCCC" w:sz="1"/>
+              <w:left w:val="single" w:color="CCCCCC" w:sz="1"/>
+              <w:bottom w:val="single" w:color="CCCCCC" w:sz="1"/>
+              <w:right w:val="single" w:color="CCCCCC" w:sz="1"/>
+            </w:tcBorders>
+            <w:shd w:fill="F4F4FB" w:val="clear"/>
+            <w:tcMar>
+              <w:top w:type="dxa" w:w="80"/>
+              <w:left w:type="dxa" w:w="120"/>
+              <w:bottom w:type="dxa" w:w="80"/>
+              <w:right w:type="dxa" w:w="120"/>
+            </w:tcMar>
+          </w:tcPr>
+          <w:p>
+            <w:r>
+              <w:rPr>
+                <w:color w:val="555555"/>
+                <w:sz w:val="18"/>
+                <w:szCs w:val="18"/>
+              </w:rPr>
+              <w:t>Decisión de ingeniería</w:t>
+            </w:r>
+          </w:p>
+        </w:tc>
+      </w:tr>
+      <w:tr>
+        <w:tc>
+          <w:tcPr>
+            <w:tcW w:type="dxa" w:w="3200"/>
+            <w:tcBorders>
+              <w:top w:val="single" w:color="CCCCCC" w:sz="1"/>
+              <w:left w:val="single" w:color="CCCCCC" w:sz="1"/>
+              <w:bottom w:val="single" w:color="CCCCCC" w:sz="1"/>
+              <w:right w:val="single" w:color="CCCCCC" w:sz="1"/>
+            </w:tcBorders>
+            <w:shd w:fill="F4F4FB" w:val="clear"/>
+            <w:tcMar>
+              <w:top w:type="dxa" w:w="80"/>
+              <w:left w:type="dxa" w:w="120"/>
+              <w:bottom w:type="dxa" w:w="80"/>
+              <w:right w:type="dxa" w:w="120"/>
+            </w:tcMar>
+          </w:tcPr>
+          <w:p>
+            <w:r>
+              <w:rPr>
+                <w:b/>
+                <w:bCs/>
+                <w:sz w:val="19"/>
+                <w:szCs w:val="19"/>
+              </w:rPr>
+              <w:t>Una sola pista a pedido por pregunta</w:t>
+            </w:r>
+          </w:p>
+        </w:tc>
+        <w:tc>
+          <w:tcPr>
+            <w:tcW w:type="dxa" w:w="4560"/>
+            <w:tcBorders>
+              <w:top w:val="single" w:color="CCCCCC" w:sz="1"/>
+              <w:left w:val="single" w:color="CCCCCC" w:sz="1"/>
+              <w:bottom w:val="single" w:color="CCCCCC" w:sz="1"/>
+              <w:right w:val="single" w:color="CCCCCC" w:sz="1"/>
+            </w:tcBorders>
+            <w:shd w:fill="F4F4FB" w:val="clear"/>
+            <w:tcMar>
+              <w:top w:type="dxa" w:w="80"/>
+              <w:left w:type="dxa" w:w="120"/>
+              <w:bottom w:type="dxa" w:w="80"/>
+              <w:right w:type="dxa" w:w="120"/>
+            </w:tcMar>
+          </w:tcPr>
+          <w:p>
+            <w:r>
+              <w:rPr>
+                <w:sz w:val="19"/>
+                <w:szCs w:val="19"/>
+              </w:rPr>
+              <w:t>Si el alumno vuelve a pedir ayuda en la misma pregunta, esta se cierra como no resuelta y puede reintentarla en modo práctica. Sin este límite, encadenar pistas terminaba guiándolo hasta la respuesta. La pista que da el portón de dominio al equivocarse es aparte y no cuenta.</w:t>
+            </w:r>
+          </w:p>
+        </w:tc>
+        <w:tc>
+          <w:tcPr>
+            <w:tcW w:type="dxa" w:w="1600"/>
+            <w:tcBorders>
+              <w:top w:val="single" w:color="CCCCCC" w:sz="1"/>
+              <w:left w:val="single" w:color="CCCCCC" w:sz="1"/>
+              <w:bottom w:val="single" w:color="CCCCCC" w:sz="1"/>
+              <w:right w:val="single" w:color="CCCCCC" w:sz="1"/>
+            </w:tcBorders>
+            <w:shd w:fill="F4F4FB" w:val="clear"/>
+            <w:tcMar>
+              <w:top w:type="dxa" w:w="80"/>
+              <w:left w:type="dxa" w:w="120"/>
+              <w:bottom w:type="dxa" w:w="80"/>
+              <w:right w:type="dxa" w:w="120"/>
+            </w:tcMar>
+          </w:tcPr>
+          <w:p>
+            <w:r>
+              <w:rPr>
+                <w:color w:val="555555"/>
+                <w:sz w:val="18"/>
+                <w:szCs w:val="18"/>
+              </w:rPr>
+              <w:t>Andamiaje acotado (Wood, Bruner &amp; Ross, 1976)</w:t>
+            </w:r>
+          </w:p>
+        </w:tc>
+      </w:tr>
+      <w:tr>
+        <w:tc>
+          <w:tcPr>
+            <w:tcW w:type="dxa" w:w="3200"/>
+            <w:tcBorders>
+              <w:top w:val="single" w:color="CCCCCC" w:sz="1"/>
+              <w:left w:val="single" w:color="CCCCCC" w:sz="1"/>
+              <w:bottom w:val="single" w:color="CCCCCC" w:sz="1"/>
+              <w:right w:val="single" w:color="CCCCCC" w:sz="1"/>
+            </w:tcBorders>
+            <w:shd w:fill="F4F4FB" w:val="clear"/>
+            <w:tcMar>
+              <w:top w:type="dxa" w:w="80"/>
+              <w:left w:type="dxa" w:w="120"/>
+              <w:bottom w:type="dxa" w:w="80"/>
+              <w:right w:type="dxa" w:w="120"/>
+            </w:tcMar>
+          </w:tcPr>
+          <w:p>
+            <w:r>
+              <w:rPr>
+                <w:b/>
+                <w:bCs/>
+                <w:sz w:val="19"/>
+                <w:szCs w:val="19"/>
+              </w:rPr>
+              <w:t>Barra de progreso y pregunta actual fija en el chat</w:t>
+            </w:r>
+          </w:p>
+        </w:tc>
+        <w:tc>
+          <w:tcPr>
+            <w:tcW w:type="dxa" w:w="4560"/>
+            <w:tcBorders>
+              <w:top w:val="single" w:color="CCCCCC" w:sz="1"/>
+              <w:left w:val="single" w:color="CCCCCC" w:sz="1"/>
+              <w:bottom w:val="single" w:color="CCCCCC" w:sz="1"/>
+              <w:right w:val="single" w:color="CCCCCC" w:sz="1"/>
+            </w:tcBorders>
+            <w:shd w:fill="F4F4FB" w:val="clear"/>
+            <w:tcMar>
+              <w:top w:type="dxa" w:w="80"/>
+              <w:left w:type="dxa" w:w="120"/>
+              <w:bottom w:type="dxa" w:w="80"/>
+              <w:right w:type="dxa" w:w="120"/>
+            </w:tcMar>
+          </w:tcPr>
+          <w:p>
+            <w:r>
+              <w:rPr>
+                <w:sz w:val="19"/>
+                <w:szCs w:val="19"/>
+              </w:rPr>
+              <w:t>El alumno ve cuántas preguntas le faltan y tiene siempre a la vista la pregunta que está respondiendo. Sin esto, tenía que buscarla subiendo en la conversación.</w:t>
+            </w:r>
+          </w:p>
+        </w:tc>
+        <w:tc>
+          <w:tcPr>
+            <w:tcW w:type="dxa" w:w="1600"/>
+            <w:tcBorders>
+              <w:top w:val="single" w:color="CCCCCC" w:sz="1"/>
+              <w:left w:val="single" w:color="CCCCCC" w:sz="1"/>
+              <w:bottom w:val="single" w:color="CCCCCC" w:sz="1"/>
+              <w:right w:val="single" w:color="CCCCCC" w:sz="1"/>
+            </w:tcBorders>
+            <w:shd w:fill="F4F4FB" w:val="clear"/>
+            <w:tcMar>
+              <w:top w:type="dxa" w:w="80"/>
+              <w:left w:type="dxa" w:w="120"/>
+              <w:bottom w:type="dxa" w:w="80"/>
+              <w:right w:type="dxa" w:w="120"/>
+            </w:tcMar>
+          </w:tcPr>
+          <w:p>
+            <w:r>
+              <w:rPr>
+                <w:color w:val="555555"/>
+                <w:sz w:val="18"/>
+                <w:szCs w:val="18"/>
+              </w:rPr>
+              <w:t>Decisión de diseño</w:t>
+            </w:r>
+          </w:p>
+        </w:tc>
+      </w:tr>
+      <w:tr>
+        <w:tc>
+          <w:tcPr>
+            <w:tcW w:type="dxa" w:w="3200"/>
+            <w:tcBorders>
+              <w:top w:val="single" w:color="CCCCCC" w:sz="1"/>
+              <w:left w:val="single" w:color="CCCCCC" w:sz="1"/>
+              <w:bottom w:val="single" w:color="CCCCCC" w:sz="1"/>
+              <w:right w:val="single" w:color="CCCCCC" w:sz="1"/>
+            </w:tcBorders>
+            <w:shd w:fill="F4F4FB" w:val="clear"/>
+            <w:tcMar>
+              <w:top w:type="dxa" w:w="80"/>
+              <w:left w:type="dxa" w:w="120"/>
+              <w:bottom w:type="dxa" w:w="80"/>
+              <w:right w:type="dxa" w:w="120"/>
+            </w:tcMar>
+          </w:tcPr>
+          <w:p>
+            <w:r>
+              <w:rPr>
+                <w:b/>
+                <w:bCs/>
+                <w:sz w:val="19"/>
+                <w:szCs w:val="19"/>
+              </w:rPr>
+              <w:t>Encuesta breve al alumno sobre la ayuda del tutor</w:t>
+            </w:r>
+          </w:p>
+        </w:tc>
+        <w:tc>
+          <w:tcPr>
+            <w:tcW w:type="dxa" w:w="4560"/>
+            <w:tcBorders>
+              <w:top w:val="single" w:color="CCCCCC" w:sz="1"/>
+              <w:left w:val="single" w:color="CCCCCC" w:sz="1"/>
+              <w:bottom w:val="single" w:color="CCCCCC" w:sz="1"/>
+              <w:right w:val="single" w:color="CCCCCC" w:sz="1"/>
+            </w:tcBorders>
+            <w:shd w:fill="F4F4FB" w:val="clear"/>
+            <w:tcMar>
+              <w:top w:type="dxa" w:w="80"/>
+              <w:left w:type="dxa" w:w="120"/>
+              <w:bottom w:type="dxa" w:w="80"/>
+              <w:right w:type="dxa" w:w="120"/>
+            </w:tcMar>
+          </w:tcPr>
+          <w:p>
+            <w:r>
+              <w:rPr>
+                <w:sz w:val="19"/>
+                <w:szCs w:val="19"/>
+              </w:rPr>
+              <w:t>Al terminar la actividad, el alumno vota si la ayuda le resultó clara (un voto por alumno y clase). El docente ve el porcentaje en sus métricas como indicador de cómo perciben al tutor.</w:t>
+            </w:r>
+          </w:p>
+        </w:tc>
+        <w:tc>
+          <w:tcPr>
+            <w:tcW w:type="dxa" w:w="1600"/>
+            <w:tcBorders>
+              <w:top w:val="single" w:color="CCCCCC" w:sz="1"/>
+              <w:left w:val="single" w:color="CCCCCC" w:sz="1"/>
+              <w:bottom w:val="single" w:color="CCCCCC" w:sz="1"/>
+              <w:right w:val="single" w:color="CCCCCC" w:sz="1"/>
+            </w:tcBorders>
+            <w:shd w:fill="F4F4FB" w:val="clear"/>
+            <w:tcMar>
+              <w:top w:type="dxa" w:w="80"/>
+              <w:left w:type="dxa" w:w="120"/>
+              <w:bottom w:type="dxa" w:w="80"/>
+              <w:right w:type="dxa" w:w="120"/>
+            </w:tcMar>
+          </w:tcPr>
+          <w:p>
+            <w:r>
+              <w:rPr>
+                <w:color w:val="555555"/>
+                <w:sz w:val="18"/>
+                <w:szCs w:val="18"/>
+              </w:rPr>
+              <w:t>Decisión de diseño</w:t>
+            </w:r>
+          </w:p>
+        </w:tc>
+      </w:tr>
+      <w:tr>
+        <w:tc>
+          <w:tcPr>
+            <w:tcW w:type="dxa" w:w="3200"/>
+            <w:tcBorders>
+              <w:top w:val="single" w:color="CCCCCC" w:sz="1"/>
+              <w:left w:val="single" w:color="CCCCCC" w:sz="1"/>
+              <w:bottom w:val="single" w:color="CCCCCC" w:sz="1"/>
+              <w:right w:val="single" w:color="CCCCCC" w:sz="1"/>
+            </w:tcBorders>
+            <w:shd w:fill="F4F4FB" w:val="clear"/>
+            <w:tcMar>
+              <w:top w:type="dxa" w:w="80"/>
+              <w:left w:type="dxa" w:w="120"/>
+              <w:bottom w:type="dxa" w:w="80"/>
+              <w:right w:type="dxa" w:w="120"/>
+            </w:tcMar>
+          </w:tcPr>
+          <w:p>
+            <w:r>
+              <w:rPr>
+                <w:b/>
+                <w:bCs/>
+                <w:sz w:val="19"/>
+                <w:szCs w:val="19"/>
+              </w:rPr>
+              <w:t>Métricas ordenadas por promedio, incluidos quienes no participaron</w:t>
+            </w:r>
+          </w:p>
+        </w:tc>
+        <w:tc>
+          <w:tcPr>
+            <w:tcW w:type="dxa" w:w="4560"/>
+            <w:tcBorders>
+              <w:top w:val="single" w:color="CCCCCC" w:sz="1"/>
+              <w:left w:val="single" w:color="CCCCCC" w:sz="1"/>
+              <w:bottom w:val="single" w:color="CCCCCC" w:sz="1"/>
+              <w:right w:val="single" w:color="CCCCCC" w:sz="1"/>
+            </w:tcBorders>
+            <w:shd w:fill="F4F4FB" w:val="clear"/>
+            <w:tcMar>
+              <w:top w:type="dxa" w:w="80"/>
+              <w:left w:type="dxa" w:w="120"/>
+              <w:bottom w:type="dxa" w:w="80"/>
+              <w:right w:type="dxa" w:w="120"/>
+            </w:tcMar>
+          </w:tcPr>
+          <w:p>
+            <w:r>
+              <w:rPr>
+                <w:sz w:val="19"/>
+                <w:szCs w:val="19"/>
+              </w:rPr>
+              <w:t>Con el orden «Menor», el docente ve arriba a quienes todavía no empezaron. Antes, los alumnos sin respuestas quedaban siempre al fondo de la lista.</w:t>
+            </w:r>
+          </w:p>
+        </w:tc>
+        <w:tc>
+          <w:tcPr>
+            <w:tcW w:type="dxa" w:w="1600"/>
+            <w:tcBorders>
+              <w:top w:val="single" w:color="CCCCCC" w:sz="1"/>
+              <w:left w:val="single" w:color="CCCCCC" w:sz="1"/>
+              <w:bottom w:val="single" w:color="CCCCCC" w:sz="1"/>
+              <w:right w:val="single" w:color="CCCCCC" w:sz="1"/>
+            </w:tcBorders>
+            <w:shd w:fill="F4F4FB" w:val="clear"/>
+            <w:tcMar>
+              <w:top w:type="dxa" w:w="80"/>
+              <w:left w:type="dxa" w:w="120"/>
+              <w:bottom w:type="dxa" w:w="80"/>
+              <w:right w:type="dxa" w:w="120"/>
+            </w:tcMar>
+          </w:tcPr>
+          <w:p>
+            <w:r>
+              <w:rPr>
+                <w:color w:val="555555"/>
+                <w:sz w:val="18"/>
+                <w:szCs w:val="18"/>
+              </w:rPr>
+              <w:t>Decisión de diseño</w:t>
+            </w:r>
+          </w:p>
+        </w:tc>
+      </w:tr>
+      <w:tr>
+        <w:tc>
+          <w:tcPr>
+            <w:tcW w:type="dxa" w:w="3200"/>
+            <w:tcBorders>
+              <w:top w:val="single" w:color="CCCCCC" w:sz="1"/>
+              <w:left w:val="single" w:color="CCCCCC" w:sz="1"/>
+              <w:bottom w:val="single" w:color="CCCCCC" w:sz="1"/>
+              <w:right w:val="single" w:color="CCCCCC" w:sz="1"/>
+            </w:tcBorders>
+            <w:shd w:fill="F4F4FB" w:val="clear"/>
+            <w:tcMar>
+              <w:top w:type="dxa" w:w="80"/>
+              <w:left w:type="dxa" w:w="120"/>
+              <w:bottom w:type="dxa" w:w="80"/>
+              <w:right w:type="dxa" w:w="120"/>
+            </w:tcMar>
+          </w:tcPr>
+          <w:p>
+            <w:r>
+              <w:rPr>
+                <w:b/>
+                <w:bCs/>
+                <w:sz w:val="19"/>
+                <w:szCs w:val="19"/>
+              </w:rPr>
+              <w:t>Resumen del docente sin datos personales (códigos [A1], [A2]…)</w:t>
+            </w:r>
+          </w:p>
+        </w:tc>
+        <w:tc>
+          <w:tcPr>
+            <w:tcW w:type="dxa" w:w="4560"/>
+            <w:tcBorders>
+              <w:top w:val="single" w:color="CCCCCC" w:sz="1"/>
+              <w:left w:val="single" w:color="CCCCCC" w:sz="1"/>
+              <w:bottom w:val="single" w:color="CCCCCC" w:sz="1"/>
+              <w:right w:val="single" w:color="CCCCCC" w:sz="1"/>
+            </w:tcBorders>
+            <w:shd w:fill="F4F4FB" w:val="clear"/>
+            <w:tcMar>
+              <w:top w:type="dxa" w:w="80"/>
+              <w:left w:type="dxa" w:w="120"/>
+              <w:bottom w:type="dxa" w:w="80"/>
+              <w:right w:type="dxa" w:w="120"/>
+            </w:tcMar>
+          </w:tcPr>
+          <w:p>
+            <w:r>
+              <w:rPr>
+                <w:sz w:val="19"/>
+                <w:szCs w:val="19"/>
+              </w:rPr>
+              <w:t>Antes de consultar al modelo externo, el nombre de cada alumno se reemplaza por un código, y los nombres reales se restituyen en el servidor. Sin esto, datos de menores de edad salían del país hacia el proveedor de IA.</w:t>
+            </w:r>
+          </w:p>
+        </w:tc>
+        <w:tc>
+          <w:tcPr>
+            <w:tcW w:type="dxa" w:w="1600"/>
+            <w:tcBorders>
+              <w:top w:val="single" w:color="CCCCCC" w:sz="1"/>
+              <w:left w:val="single" w:color="CCCCCC" w:sz="1"/>
+              <w:bottom w:val="single" w:color="CCCCCC" w:sz="1"/>
+              <w:right w:val="single" w:color="CCCCCC" w:sz="1"/>
+            </w:tcBorders>
+            <w:shd w:fill="F4F4FB" w:val="clear"/>
+            <w:tcMar>
+              <w:top w:type="dxa" w:w="80"/>
+              <w:left w:type="dxa" w:w="120"/>
+              <w:bottom w:type="dxa" w:w="80"/>
+              <w:right w:type="dxa" w:w="120"/>
+            </w:tcMar>
+          </w:tcPr>
+          <w:p>
+            <w:r>
+              <w:rPr>
+                <w:color w:val="555555"/>
+                <w:sz w:val="18"/>
+                <w:szCs w:val="18"/>
+              </w:rPr>
+              <w:t>Ley 25.326 (2000), arts. 4 y 12</w:t>
+            </w:r>
+          </w:p>
+        </w:tc>
+      </w:tr>
+      <w:tr>
+        <w:tc>
+          <w:tcPr>
+            <w:tcW w:type="dxa" w:w="3200"/>
+            <w:tcBorders>
+              <w:top w:val="single" w:color="CCCCCC" w:sz="1"/>
+              <w:left w:val="single" w:color="CCCCCC" w:sz="1"/>
+              <w:bottom w:val="single" w:color="CCCCCC" w:sz="1"/>
+              <w:right w:val="single" w:color="CCCCCC" w:sz="1"/>
+            </w:tcBorders>
+            <w:shd w:fill="F4F4FB" w:val="clear"/>
+            <w:tcMar>
+              <w:top w:type="dxa" w:w="80"/>
+              <w:left w:type="dxa" w:w="120"/>
+              <w:bottom w:type="dxa" w:w="80"/>
+              <w:right w:type="dxa" w:w="120"/>
+            </w:tcMar>
+          </w:tcPr>
+          <w:p>
+            <w:r>
+              <w:rPr>
+                <w:b/>
+                <w:bCs/>
+                <w:sz w:val="19"/>
+                <w:szCs w:val="19"/>
+              </w:rPr>
+              <w:t>Pruebas automáticas del módulo de seguimiento docente</w:t>
+            </w:r>
+          </w:p>
+        </w:tc>
+        <w:tc>
+          <w:tcPr>
+            <w:tcW w:type="dxa" w:w="4560"/>
+            <w:tcBorders>
+              <w:top w:val="single" w:color="CCCCCC" w:sz="1"/>
+              <w:left w:val="single" w:color="CCCCCC" w:sz="1"/>
+              <w:bottom w:val="single" w:color="CCCCCC" w:sz="1"/>
+              <w:right w:val="single" w:color="CCCCCC" w:sz="1"/>
+            </w:tcBorders>
+            <w:shd w:fill="F4F4FB" w:val="clear"/>
+            <w:tcMar>
+              <w:top w:type="dxa" w:w="80"/>
+              <w:left w:type="dxa" w:w="120"/>
+              <w:bottom w:type="dxa" w:w="80"/>
+              <w:right w:type="dxa" w:w="120"/>
+            </w:tcMar>
+          </w:tcPr>
+          <w:p>
+            <w:r>
+              <w:rPr>
+                <w:sz w:val="19"/>
+                <w:szCs w:val="19"/>
+              </w:rPr>
+              <w:t>Verifican el cálculo de las métricas, que el resumen se regenere solo cuando cambian los datos y que ningún nombre llegue a la IA. Sin ellas, el cuarto objetivo específico de la tesis no tenía evidencia.</w:t>
+            </w:r>
+          </w:p>
+        </w:tc>
+        <w:tc>
+          <w:tcPr>
+            <w:tcW w:type="dxa" w:w="1600"/>
+            <w:tcBorders>
+              <w:top w:val="single" w:color="CCCCCC" w:sz="1"/>
+              <w:left w:val="single" w:color="CCCCCC" w:sz="1"/>
+              <w:bottom w:val="single" w:color="CCCCCC" w:sz="1"/>
+              <w:right w:val="single" w:color="CCCCCC" w:sz="1"/>
+            </w:tcBorders>
+            <w:shd w:fill="F4F4FB" w:val="clear"/>
+            <w:tcMar>
+              <w:top w:type="dxa" w:w="80"/>
+              <w:left w:type="dxa" w:w="120"/>
+              <w:bottom w:type="dxa" w:w="80"/>
+              <w:right w:type="dxa" w:w="120"/>
+            </w:tcMar>
+          </w:tcPr>
+          <w:p>
+            <w:r>
+              <w:rPr>
+                <w:color w:val="555555"/>
+                <w:sz w:val="18"/>
+                <w:szCs w:val="18"/>
+              </w:rPr>
+              <w:t>Decisión de ingeniería</w:t>
+            </w:r>
+          </w:p>
+        </w:tc>
+      </w:tr>
+      <w:tr>
+        <w:tc>
+          <w:tcPr>
+            <w:tcW w:type="dxa" w:w="3200"/>
+            <w:tcBorders>
+              <w:top w:val="single" w:color="CCCCCC" w:sz="1"/>
+              <w:left w:val="single" w:color="CCCCCC" w:sz="1"/>
+              <w:bottom w:val="single" w:color="CCCCCC" w:sz="1"/>
+              <w:right w:val="single" w:color="CCCCCC" w:sz="1"/>
+            </w:tcBorders>
+            <w:shd w:fill="F4F4FB" w:val="clear"/>
+            <w:tcMar>
+              <w:top w:type="dxa" w:w="80"/>
+              <w:left w:type="dxa" w:w="120"/>
+              <w:bottom w:type="dxa" w:w="80"/>
+              <w:right w:type="dxa" w:w="120"/>
+            </w:tcMar>
+          </w:tcPr>
+          <w:p>
+            <w:r>
+              <w:rPr>
+                <w:b/>
+                <w:bCs/>
+                <w:sz w:val="19"/>
+                <w:szCs w:val="19"/>
+              </w:rPr>
+              <w:t>Prueba de alucinación que exige contexto vacío fuera de tema</w:t>
+            </w:r>
+          </w:p>
+        </w:tc>
+        <w:tc>
+          <w:tcPr>
+            <w:tcW w:type="dxa" w:w="4560"/>
+            <w:tcBorders>
+              <w:top w:val="single" w:color="CCCCCC" w:sz="1"/>
+              <w:left w:val="single" w:color="CCCCCC" w:sz="1"/>
+              <w:bottom w:val="single" w:color="CCCCCC" w:sz="1"/>
+              <w:right w:val="single" w:color="CCCCCC" w:sz="1"/>
+            </w:tcBorders>
+            <w:shd w:fill="F4F4FB" w:val="clear"/>
+            <w:tcMar>
+              <w:top w:type="dxa" w:w="80"/>
+              <w:left w:type="dxa" w:w="120"/>
+              <w:bottom w:type="dxa" w:w="80"/>
+              <w:right w:type="dxa" w:w="120"/>
+            </w:tcMar>
+          </w:tcPr>
+          <w:p>
+            <w:r>
+              <w:rPr>
+                <w:sz w:val="19"/>
+                <w:szCs w:val="19"/>
+              </w:rPr>
+              <w:t>La prueba anterior pasaba aunque el umbral de similitud se rompiera. Ahora falla si una pregunta ajena al texto recupera algún fragmento.</w:t>
+            </w:r>
+          </w:p>
+        </w:tc>
+        <w:tc>
+          <w:tcPr>
+            <w:tcW w:type="dxa" w:w="1600"/>
+            <w:tcBorders>
+              <w:top w:val="single" w:color="CCCCCC" w:sz="1"/>
+              <w:left w:val="single" w:color="CCCCCC" w:sz="1"/>
+              <w:bottom w:val="single" w:color="CCCCCC" w:sz="1"/>
+              <w:right w:val="single" w:color="CCCCCC" w:sz="1"/>
+            </w:tcBorders>
+            <w:shd w:fill="F4F4FB" w:val="clear"/>
+            <w:tcMar>
+              <w:top w:type="dxa" w:w="80"/>
+              <w:left w:type="dxa" w:w="120"/>
+              <w:bottom w:type="dxa" w:w="80"/>
+              <w:right w:type="dxa" w:w="120"/>
+            </w:tcMar>
+          </w:tcPr>
+          <w:p>
+            <w:r>
+              <w:rPr>
+                <w:color w:val="555555"/>
+                <w:sz w:val="18"/>
+                <w:szCs w:val="18"/>
+              </w:rPr>
+              <w:t>Decisión de ingeniería</w:t>
             </w:r>
           </w:p>
         </w:tc>
@@ -2495,6 +3355,18 @@
           <w:szCs w:val="19"/>
         </w:rPr>
         <w:t xml:space="preserve">Wood, D., Bruner, J. S., &amp; Ross, G. (1976). The Role of Tutoring in Problem Solving. Journal of Child Psychology and Psychiatry, 17(2), 89-100.</w:t>
+      </w:r>
+    </w:p>
+    <w:p>
+      <w:pPr>
+        <w:spacing w:after="80"/>
+      </w:pPr>
+      <w:r>
+        <w:rPr>
+          <w:sz w:val="19"/>
+          <w:szCs w:val="19"/>
+        </w:rPr>
+        <w:t>Ley 25.326. (2000). Protección de los datos personales. Boletín Oficial de la República Argentina.</w:t>
       </w:r>
     </w:p>
     <w:sectPr>

</xml_diff>